<commit_message>
docs: enrichissement massif de tous les documents Word
</commit_message>
<xml_diff>
--- a/docs/1_Cahier_des_Charges.docx
+++ b/docs/1_Cahier_des_Charges.docx
@@ -2,13 +2,21 @@
 <file path=word/document.xml><?xml version="1.0" encoding="utf-8"?>
 <w:document xmlns:wpc="http://schemas.microsoft.com/office/word/2010/wordprocessingCanvas" xmlns:mo="http://schemas.microsoft.com/office/mac/office/2008/main" xmlns:mc="http://schemas.openxmlformats.org/markup-compatibility/2006" xmlns:mv="urn:schemas-microsoft-com:mac:vml" xmlns:o="urn:schemas-microsoft-com:office:office" xmlns:r="http://schemas.openxmlformats.org/officeDocument/2006/relationships" xmlns:m="http://schemas.openxmlformats.org/officeDocument/2006/math" xmlns:v="urn:schemas-microsoft-com:vml" xmlns:wp14="http://schemas.microsoft.com/office/word/2010/wordprocessingDrawing" xmlns:wp="http://schemas.openxmlformats.org/drawingml/2006/wordprocessingDrawing" xmlns:w10="urn:schemas-microsoft-com:office:word" xmlns:w="http://schemas.openxmlformats.org/wordprocessingml/2006/main" xmlns:w14="http://schemas.microsoft.com/office/word/2010/wordml" xmlns:wpg="http://schemas.microsoft.com/office/word/2010/wordprocessingGroup" xmlns:wpi="http://schemas.microsoft.com/office/word/2010/wordprocessingInk" xmlns:wne="http://schemas.microsoft.com/office/word/2006/wordml" xmlns:wps="http://schemas.microsoft.com/office/word/2010/wordprocessingShape" mc:Ignorable="w14 wp14">
   <w:body>
+    <w:p/>
+    <w:p/>
+    <w:p/>
+    <w:p/>
     <w:p>
+      <w:pPr>
+        <w:jc w:val="center"/>
+      </w:pPr>
       <w:r>
-        <w:br/>
-        <w:br/>
-        <w:br/>
-        <w:br/>
-        <w:br/>
+        <w:rPr>
+          <w:b/>
+          <w:color w:val="1A4BAD"/>
+          <w:sz w:val="64"/>
+        </w:rPr>
+        <w:t>CAHIER DES CHARGES</w:t>
       </w:r>
     </w:p>
     <w:p>
@@ -17,11 +25,10 @@
       </w:pPr>
       <w:r>
         <w:rPr>
-          <w:b/>
-          <w:color w:val="1A4BAD"/>
-          <w:sz w:val="72"/>
+          <w:color w:val="10B981"/>
+          <w:sz w:val="28"/>
         </w:rPr>
-        <w:t>Cahier des Charges</w:t>
+        <w:t>____________________________________________________________</w:t>
       </w:r>
     </w:p>
     <w:p>
@@ -30,45 +37,234 @@
       </w:pPr>
       <w:r>
         <w:rPr>
-          <w:color w:val="646464"/>
-          <w:sz w:val="36"/>
+          <w:i/>
+          <w:color w:val="64748B"/>
+          <w:sz w:val="32"/>
         </w:rPr>
-        <w:t>Spécifications des besoins du projet UniGames</w:t>
+        <w:t>Specifications et exigences du projet UniGames</w:t>
+      </w:r>
+    </w:p>
+    <w:p/>
+    <w:p/>
+    <w:p/>
+    <w:p/>
+    <w:p/>
+    <w:p/>
+    <w:p/>
+    <w:p/>
+    <w:tbl>
+      <w:tblPr>
+        <w:tblW w:type="auto" w:w="0"/>
+        <w:jc w:val="right"/>
+        <w:tblLook w:firstColumn="1" w:firstRow="1" w:lastColumn="0" w:lastRow="0" w:noHBand="0" w:noVBand="1" w:val="04A0"/>
+      </w:tblPr>
+      <w:tblGrid>
+        <w:gridCol w:w="4320"/>
+        <w:gridCol w:w="4320"/>
+      </w:tblGrid>
+      <w:tr>
+        <w:tc>
+          <w:tcPr>
+            <w:tcW w:type="dxa" w:w="4320"/>
+          </w:tcPr>
+          <w:p>
+            <w:r>
+              <w:rPr>
+                <w:b/>
+                <w:color w:val="64748B"/>
+                <w:sz w:val="20"/>
+              </w:rPr>
+              <w:t>Projet</w:t>
+            </w:r>
+          </w:p>
+        </w:tc>
+        <w:tc>
+          <w:tcPr>
+            <w:tcW w:type="dxa" w:w="4320"/>
+          </w:tcPr>
+          <w:p>
+            <w:r>
+              <w:rPr>
+                <w:color w:val="1E293B"/>
+                <w:sz w:val="20"/>
+              </w:rPr>
+              <w:t>UniGames - Plateforme de Gestion de Competitions Universitaires</w:t>
+            </w:r>
+          </w:p>
+        </w:tc>
+      </w:tr>
+      <w:tr>
+        <w:tc>
+          <w:tcPr>
+            <w:tcW w:type="dxa" w:w="4320"/>
+          </w:tcPr>
+          <w:p>
+            <w:r>
+              <w:rPr>
+                <w:b/>
+                <w:color w:val="64748B"/>
+                <w:sz w:val="20"/>
+              </w:rPr>
+              <w:t>Client</w:t>
+            </w:r>
+          </w:p>
+        </w:tc>
+        <w:tc>
+          <w:tcPr>
+            <w:tcW w:type="dxa" w:w="4320"/>
+          </w:tcPr>
+          <w:p>
+            <w:r>
+              <w:rPr>
+                <w:color w:val="1E293B"/>
+                <w:sz w:val="20"/>
+              </w:rPr>
+              <w:t>Direction des Sports Universitaires de Guinee</w:t>
+            </w:r>
+          </w:p>
+        </w:tc>
+      </w:tr>
+      <w:tr>
+        <w:tc>
+          <w:tcPr>
+            <w:tcW w:type="dxa" w:w="4320"/>
+          </w:tcPr>
+          <w:p>
+            <w:r>
+              <w:rPr>
+                <w:b/>
+                <w:color w:val="64748B"/>
+                <w:sz w:val="20"/>
+              </w:rPr>
+              <w:t>Version</w:t>
+            </w:r>
+          </w:p>
+        </w:tc>
+        <w:tc>
+          <w:tcPr>
+            <w:tcW w:type="dxa" w:w="4320"/>
+          </w:tcPr>
+          <w:p>
+            <w:r>
+              <w:rPr>
+                <w:color w:val="1E293B"/>
+                <w:sz w:val="20"/>
+              </w:rPr>
+              <w:t>2.0</w:t>
+            </w:r>
+          </w:p>
+        </w:tc>
+      </w:tr>
+      <w:tr>
+        <w:tc>
+          <w:tcPr>
+            <w:tcW w:type="dxa" w:w="4320"/>
+          </w:tcPr>
+          <w:p>
+            <w:r>
+              <w:rPr>
+                <w:b/>
+                <w:color w:val="64748B"/>
+                <w:sz w:val="20"/>
+              </w:rPr>
+              <w:t>Date</w:t>
+            </w:r>
+          </w:p>
+        </w:tc>
+        <w:tc>
+          <w:tcPr>
+            <w:tcW w:type="dxa" w:w="4320"/>
+          </w:tcPr>
+          <w:p>
+            <w:r>
+              <w:rPr>
+                <w:color w:val="1E293B"/>
+                <w:sz w:val="20"/>
+              </w:rPr>
+              <w:t>Juin 2026</w:t>
+            </w:r>
+          </w:p>
+        </w:tc>
+      </w:tr>
+      <w:tr>
+        <w:tc>
+          <w:tcPr>
+            <w:tcW w:type="dxa" w:w="4320"/>
+          </w:tcPr>
+          <w:p>
+            <w:r>
+              <w:rPr>
+                <w:b/>
+                <w:color w:val="64748B"/>
+                <w:sz w:val="20"/>
+              </w:rPr>
+              <w:t>Auteur</w:t>
+            </w:r>
+          </w:p>
+        </w:tc>
+        <w:tc>
+          <w:tcPr>
+            <w:tcW w:type="dxa" w:w="4320"/>
+          </w:tcPr>
+          <w:p>
+            <w:r>
+              <w:rPr>
+                <w:color w:val="1E293B"/>
+                <w:sz w:val="20"/>
+              </w:rPr>
+              <w:t>Equipe de Developpement UniGames</w:t>
+            </w:r>
+          </w:p>
+        </w:tc>
+      </w:tr>
+      <w:tr>
+        <w:tc>
+          <w:tcPr>
+            <w:tcW w:type="dxa" w:w="4320"/>
+          </w:tcPr>
+          <w:p>
+            <w:r>
+              <w:rPr>
+                <w:b/>
+                <w:color w:val="64748B"/>
+                <w:sz w:val="20"/>
+              </w:rPr>
+              <w:t>Statut</w:t>
+            </w:r>
+          </w:p>
+        </w:tc>
+        <w:tc>
+          <w:tcPr>
+            <w:tcW w:type="dxa" w:w="4320"/>
+          </w:tcPr>
+          <w:p>
+            <w:r>
+              <w:rPr>
+                <w:color w:val="1E293B"/>
+                <w:sz w:val="20"/>
+              </w:rPr>
+              <w:t>Document Final - Valide</w:t>
+            </w:r>
+          </w:p>
+        </w:tc>
+      </w:tr>
+    </w:tbl>
+    <w:p>
+      <w:r>
+        <w:br w:type="page"/>
+      </w:r>
+    </w:p>
+    <w:p>
+      <w:pPr>
+        <w:pStyle w:val="Heading1"/>
+      </w:pPr>
+      <w:r>
+        <w:t>Table des Matieres</w:t>
       </w:r>
     </w:p>
     <w:p>
       <w:r>
-        <w:br/>
-        <w:br/>
-        <w:br/>
-        <w:br/>
-        <w:br/>
-        <w:br/>
-        <w:br/>
-        <w:br/>
-        <w:br/>
-        <w:br/>
-        <w:br/>
-        <w:br/>
-        <w:br/>
-        <w:br/>
-        <w:br/>
-      </w:r>
-    </w:p>
-    <w:p>
-      <w:pPr>
-        <w:jc w:val="right"/>
-      </w:pPr>
-      <w:r>
-        <w:rPr>
-          <w:color w:val="505050"/>
-          <w:sz w:val="24"/>
-        </w:rPr>
-        <w:t>Projet : UniGames</w:t>
-        <w:br/>
-        <w:t>Date : Juin 2026</w:t>
-        <w:br/>
-        <w:t>Version : 1.0</w:t>
+        <w:t>(A generer automatiquement via Word : References &gt; Table des matieres)</w:t>
       </w:r>
     </w:p>
     <w:p>
@@ -81,17 +277,1668 @@
         <w:pStyle w:val="Heading1"/>
       </w:pPr>
       <w:r>
-        <w:t>1. Présentation du Projet</w:t>
+        <w:t>1. Introduction Generale</w:t>
+      </w:r>
+    </w:p>
+    <w:p>
+      <w:pPr>
+        <w:pStyle w:val="Heading2"/>
+      </w:pPr>
+      <w:r>
+        <w:t>1.1. Contexte du Projet</w:t>
       </w:r>
     </w:p>
     <w:p>
       <w:r>
-        <w:t>Le projet UniGames est une plateforme web développée en Laravel, dédiée à la gestion complète de compétitions sportives inter-universitaires.</w:t>
+        <w:t>Le sport universitaire en Guinee connait un essor considerable ces dernieres annees. Les competitions inter-universitaires, regroupant des dizaines de facultes et des centaines de joueurs a travers le pays, sont devenues des evenements majeurs de la vie etudiante. Cependant, l'organisation de ces tournois repose encore largement sur des processus manuels : tableaux Excel, feuilles de match papier, classements calcules a la main et communication informelle des resultats.</w:t>
       </w:r>
     </w:p>
     <w:p>
       <w:r>
-        <w:t>Objectif principal : Digitaliser et simplifier l'organisation des tournois, la gestion des équipes, l'enregistrement des scores et la consultation des classements.</w:t>
+        <w:t>Ce mode de fonctionnement genere de nombreuses inefficacites : erreurs de calcul dans les classements, pertes de donnees, difficulte a obtenir des informations en temps reel, et absence d'historique fiable des competitions passees. Le projet UniGames nait de la volonte de moderniser et de digitaliser l'ensemble de ce processus.</w:t>
+      </w:r>
+    </w:p>
+    <w:p>
+      <w:pPr>
+        <w:pStyle w:val="Heading2"/>
+      </w:pPr>
+      <w:r>
+        <w:t>1.2. Objectifs du Projet</w:t>
+      </w:r>
+    </w:p>
+    <w:p>
+      <w:r>
+        <w:t>Objectif principal : Concevoir et developper une plateforme web complete permettant la gestion centralisee des competitions sportives inter-universitaires guineennes.</w:t>
+      </w:r>
+    </w:p>
+    <w:p>
+      <w:pPr>
+        <w:pStyle w:val="ListBullet"/>
+      </w:pPr>
+      <w:r>
+        <w:t>Objectifs secondaires :</w:t>
+      </w:r>
+    </w:p>
+    <w:p>
+      <w:pPr>
+        <w:pStyle w:val="ListBullet"/>
+      </w:pPr>
+      <w:r>
+        <w:t>Offrir un tableau de bord en temps reel avec statistiques detaillees par edition</w:t>
+      </w:r>
+    </w:p>
+    <w:p>
+      <w:pPr>
+        <w:pStyle w:val="ListBullet"/>
+      </w:pPr>
+      <w:r>
+        <w:t>Permettre la gestion complete du cycle de vie d'un tournoi (creation, planification des matchs, saisie des scores, classements automatiques)</w:t>
+      </w:r>
+    </w:p>
+    <w:p>
+      <w:pPr>
+        <w:pStyle w:val="ListBullet"/>
+      </w:pPr>
+      <w:r>
+        <w:t>Assurer la tracabilite complete des resultats et des performances des joueurs</w:t>
+      </w:r>
+    </w:p>
+    <w:p>
+      <w:pPr>
+        <w:pStyle w:val="ListBullet"/>
+      </w:pPr>
+      <w:r>
+        <w:t>Proposer une interface utilisateur moderne, reactive et intuitive</w:t>
+      </w:r>
+    </w:p>
+    <w:p>
+      <w:pPr>
+        <w:pStyle w:val="ListBullet"/>
+      </w:pPr>
+      <w:r>
+        <w:t>Implementer un systeme de gestion des droits d'acces multi-roles (Administrateur, Staff, Visiteur)</w:t>
+      </w:r>
+    </w:p>
+    <w:p>
+      <w:pPr>
+        <w:pStyle w:val="Heading2"/>
+      </w:pPr>
+      <w:r>
+        <w:t>1.3. Perimetre Fonctionnel</w:t>
+      </w:r>
+    </w:p>
+    <w:tbl>
+      <w:tblPr>
+        <w:tblStyle w:val="TableGrid"/>
+        <w:tblW w:type="auto" w:w="0"/>
+        <w:jc w:val="center"/>
+        <w:tblLook w:firstColumn="1" w:firstRow="1" w:lastColumn="0" w:lastRow="0" w:noHBand="0" w:noVBand="1" w:val="04A0"/>
+      </w:tblPr>
+      <w:tblGrid>
+        <w:gridCol w:w="2880"/>
+        <w:gridCol w:w="2880"/>
+        <w:gridCol w:w="2880"/>
+      </w:tblGrid>
+      <w:tr>
+        <w:tc>
+          <w:tcPr>
+            <w:tcW w:type="dxa" w:w="2880"/>
+            <w:shd w:fill="1A4BAD" w:val="clear"/>
+          </w:tcPr>
+          <w:p>
+            <w:pPr>
+              <w:jc w:val="center"/>
+            </w:pPr>
+            <w:r>
+              <w:rPr>
+                <w:b/>
+                <w:color w:val="FFFFFF"/>
+                <w:sz w:val="20"/>
+              </w:rPr>
+              <w:t>Module</w:t>
+            </w:r>
+          </w:p>
+        </w:tc>
+        <w:tc>
+          <w:tcPr>
+            <w:tcW w:type="dxa" w:w="2880"/>
+            <w:shd w:fill="1A4BAD" w:val="clear"/>
+          </w:tcPr>
+          <w:p>
+            <w:pPr>
+              <w:jc w:val="center"/>
+            </w:pPr>
+            <w:r>
+              <w:rPr>
+                <w:b/>
+                <w:color w:val="FFFFFF"/>
+                <w:sz w:val="20"/>
+              </w:rPr>
+              <w:t>Description</w:t>
+            </w:r>
+          </w:p>
+        </w:tc>
+        <w:tc>
+          <w:tcPr>
+            <w:tcW w:type="dxa" w:w="2880"/>
+            <w:shd w:fill="1A4BAD" w:val="clear"/>
+          </w:tcPr>
+          <w:p>
+            <w:pPr>
+              <w:jc w:val="center"/>
+            </w:pPr>
+            <w:r>
+              <w:rPr>
+                <w:b/>
+                <w:color w:val="FFFFFF"/>
+                <w:sz w:val="20"/>
+              </w:rPr>
+              <w:t>Priorite</w:t>
+            </w:r>
+          </w:p>
+        </w:tc>
+      </w:tr>
+      <w:tr>
+        <w:tc>
+          <w:tcPr>
+            <w:tcW w:type="dxa" w:w="2880"/>
+          </w:tcPr>
+          <w:p>
+            <w:r>
+              <w:rPr>
+                <w:color w:val="1E293B"/>
+                <w:sz w:val="18"/>
+              </w:rPr>
+              <w:t>Gestion des Editions</w:t>
+            </w:r>
+          </w:p>
+        </w:tc>
+        <w:tc>
+          <w:tcPr>
+            <w:tcW w:type="dxa" w:w="2880"/>
+          </w:tcPr>
+          <w:p>
+            <w:r>
+              <w:rPr>
+                <w:color w:val="1E293B"/>
+                <w:sz w:val="18"/>
+              </w:rPr>
+              <w:t>Creation, modification et suivi des competitions annuelles. Gestion du statut (a venir, en cours, terminee).</w:t>
+            </w:r>
+          </w:p>
+        </w:tc>
+        <w:tc>
+          <w:tcPr>
+            <w:tcW w:type="dxa" w:w="2880"/>
+          </w:tcPr>
+          <w:p>
+            <w:r>
+              <w:rPr>
+                <w:color w:val="1E293B"/>
+                <w:sz w:val="18"/>
+              </w:rPr>
+              <w:t>Haute</w:t>
+            </w:r>
+          </w:p>
+        </w:tc>
+      </w:tr>
+      <w:tr>
+        <w:tc>
+          <w:tcPr>
+            <w:tcW w:type="dxa" w:w="2880"/>
+            <w:shd w:fill="F1F5F9" w:val="clear"/>
+          </w:tcPr>
+          <w:p>
+            <w:r>
+              <w:rPr>
+                <w:color w:val="1E293B"/>
+                <w:sz w:val="18"/>
+              </w:rPr>
+              <w:t>Gestion des Facultes</w:t>
+            </w:r>
+          </w:p>
+        </w:tc>
+        <w:tc>
+          <w:tcPr>
+            <w:tcW w:type="dxa" w:w="2880"/>
+            <w:shd w:fill="F1F5F9" w:val="clear"/>
+          </w:tcPr>
+          <w:p>
+            <w:r>
+              <w:rPr>
+                <w:color w:val="1E293B"/>
+                <w:sz w:val="18"/>
+              </w:rPr>
+              <w:t>Enregistrement des etablissements participants avec logo et couleur identitaire.</w:t>
+            </w:r>
+          </w:p>
+        </w:tc>
+        <w:tc>
+          <w:tcPr>
+            <w:tcW w:type="dxa" w:w="2880"/>
+            <w:shd w:fill="F1F5F9" w:val="clear"/>
+          </w:tcPr>
+          <w:p>
+            <w:r>
+              <w:rPr>
+                <w:color w:val="1E293B"/>
+                <w:sz w:val="18"/>
+              </w:rPr>
+              <w:t>Haute</w:t>
+            </w:r>
+          </w:p>
+        </w:tc>
+      </w:tr>
+      <w:tr>
+        <w:tc>
+          <w:tcPr>
+            <w:tcW w:type="dxa" w:w="2880"/>
+          </w:tcPr>
+          <w:p>
+            <w:r>
+              <w:rPr>
+                <w:color w:val="1E293B"/>
+                <w:sz w:val="18"/>
+              </w:rPr>
+              <w:t>Gestion des Disciplines</w:t>
+            </w:r>
+          </w:p>
+        </w:tc>
+        <w:tc>
+          <w:tcPr>
+            <w:tcW w:type="dxa" w:w="2880"/>
+          </w:tcPr>
+          <w:p>
+            <w:r>
+              <w:rPr>
+                <w:color w:val="1E293B"/>
+                <w:sz w:val="18"/>
+              </w:rPr>
+              <w:t>Configuration des sports (Football, Basketball, Handball, Volleyball, Athletisme).</w:t>
+            </w:r>
+          </w:p>
+        </w:tc>
+        <w:tc>
+          <w:tcPr>
+            <w:tcW w:type="dxa" w:w="2880"/>
+          </w:tcPr>
+          <w:p>
+            <w:r>
+              <w:rPr>
+                <w:color w:val="1E293B"/>
+                <w:sz w:val="18"/>
+              </w:rPr>
+              <w:t>Haute</w:t>
+            </w:r>
+          </w:p>
+        </w:tc>
+      </w:tr>
+      <w:tr>
+        <w:tc>
+          <w:tcPr>
+            <w:tcW w:type="dxa" w:w="2880"/>
+            <w:shd w:fill="F1F5F9" w:val="clear"/>
+          </w:tcPr>
+          <w:p>
+            <w:r>
+              <w:rPr>
+                <w:color w:val="1E293B"/>
+                <w:sz w:val="18"/>
+              </w:rPr>
+              <w:t>Gestion des Equipes</w:t>
+            </w:r>
+          </w:p>
+        </w:tc>
+        <w:tc>
+          <w:tcPr>
+            <w:tcW w:type="dxa" w:w="2880"/>
+            <w:shd w:fill="F1F5F9" w:val="clear"/>
+          </w:tcPr>
+          <w:p>
+            <w:r>
+              <w:rPr>
+                <w:color w:val="1E293B"/>
+                <w:sz w:val="18"/>
+              </w:rPr>
+              <w:t>Inscription des equipes par faculte, par discipline et par edition. Calcul automatique des statistiques.</w:t>
+            </w:r>
+          </w:p>
+        </w:tc>
+        <w:tc>
+          <w:tcPr>
+            <w:tcW w:type="dxa" w:w="2880"/>
+            <w:shd w:fill="F1F5F9" w:val="clear"/>
+          </w:tcPr>
+          <w:p>
+            <w:r>
+              <w:rPr>
+                <w:color w:val="1E293B"/>
+                <w:sz w:val="18"/>
+              </w:rPr>
+              <w:t>Haute</w:t>
+            </w:r>
+          </w:p>
+        </w:tc>
+      </w:tr>
+      <w:tr>
+        <w:tc>
+          <w:tcPr>
+            <w:tcW w:type="dxa" w:w="2880"/>
+          </w:tcPr>
+          <w:p>
+            <w:r>
+              <w:rPr>
+                <w:color w:val="1E293B"/>
+                <w:sz w:val="18"/>
+              </w:rPr>
+              <w:t>Gestion des Joueurs</w:t>
+            </w:r>
+          </w:p>
+        </w:tc>
+        <w:tc>
+          <w:tcPr>
+            <w:tcW w:type="dxa" w:w="2880"/>
+          </w:tcPr>
+          <w:p>
+            <w:r>
+              <w:rPr>
+                <w:color w:val="1E293B"/>
+                <w:sz w:val="18"/>
+              </w:rPr>
+              <w:t>Enregistrement des joueurs avec numero de maillot, sexe, et suivi des buts marques.</w:t>
+            </w:r>
+          </w:p>
+        </w:tc>
+        <w:tc>
+          <w:tcPr>
+            <w:tcW w:type="dxa" w:w="2880"/>
+          </w:tcPr>
+          <w:p>
+            <w:r>
+              <w:rPr>
+                <w:color w:val="1E293B"/>
+                <w:sz w:val="18"/>
+              </w:rPr>
+              <w:t>Haute</w:t>
+            </w:r>
+          </w:p>
+        </w:tc>
+      </w:tr>
+      <w:tr>
+        <w:tc>
+          <w:tcPr>
+            <w:tcW w:type="dxa" w:w="2880"/>
+            <w:shd w:fill="F1F5F9" w:val="clear"/>
+          </w:tcPr>
+          <w:p>
+            <w:r>
+              <w:rPr>
+                <w:color w:val="1E293B"/>
+                <w:sz w:val="18"/>
+              </w:rPr>
+              <w:t>Gestion des Matchs</w:t>
+            </w:r>
+          </w:p>
+        </w:tc>
+        <w:tc>
+          <w:tcPr>
+            <w:tcW w:type="dxa" w:w="2880"/>
+            <w:shd w:fill="F1F5F9" w:val="clear"/>
+          </w:tcPr>
+          <w:p>
+            <w:r>
+              <w:rPr>
+                <w:color w:val="1E293B"/>
+                <w:sz w:val="18"/>
+              </w:rPr>
+              <w:t>Programmation des rencontres, saisie des scores et des buteurs, gestion des phases du tournoi.</w:t>
+            </w:r>
+          </w:p>
+        </w:tc>
+        <w:tc>
+          <w:tcPr>
+            <w:tcW w:type="dxa" w:w="2880"/>
+            <w:shd w:fill="F1F5F9" w:val="clear"/>
+          </w:tcPr>
+          <w:p>
+            <w:r>
+              <w:rPr>
+                <w:color w:val="1E293B"/>
+                <w:sz w:val="18"/>
+              </w:rPr>
+              <w:t>Critique</w:t>
+            </w:r>
+          </w:p>
+        </w:tc>
+      </w:tr>
+      <w:tr>
+        <w:tc>
+          <w:tcPr>
+            <w:tcW w:type="dxa" w:w="2880"/>
+          </w:tcPr>
+          <w:p>
+            <w:r>
+              <w:rPr>
+                <w:color w:val="1E293B"/>
+                <w:sz w:val="18"/>
+              </w:rPr>
+              <w:t>Classements</w:t>
+            </w:r>
+          </w:p>
+        </w:tc>
+        <w:tc>
+          <w:tcPr>
+            <w:tcW w:type="dxa" w:w="2880"/>
+          </w:tcPr>
+          <w:p>
+            <w:r>
+              <w:rPr>
+                <w:color w:val="1E293B"/>
+                <w:sz w:val="18"/>
+              </w:rPr>
+              <w:t>Calcul automatique des classements par discipline avec points, victoires, nuls, defaites et difference de buts.</w:t>
+            </w:r>
+          </w:p>
+        </w:tc>
+        <w:tc>
+          <w:tcPr>
+            <w:tcW w:type="dxa" w:w="2880"/>
+          </w:tcPr>
+          <w:p>
+            <w:r>
+              <w:rPr>
+                <w:color w:val="1E293B"/>
+                <w:sz w:val="18"/>
+              </w:rPr>
+              <w:t>Haute</w:t>
+            </w:r>
+          </w:p>
+        </w:tc>
+      </w:tr>
+      <w:tr>
+        <w:tc>
+          <w:tcPr>
+            <w:tcW w:type="dxa" w:w="2880"/>
+            <w:shd w:fill="F1F5F9" w:val="clear"/>
+          </w:tcPr>
+          <w:p>
+            <w:r>
+              <w:rPr>
+                <w:color w:val="1E293B"/>
+                <w:sz w:val="18"/>
+              </w:rPr>
+              <w:t>Arbre du Tournoi</w:t>
+            </w:r>
+          </w:p>
+        </w:tc>
+        <w:tc>
+          <w:tcPr>
+            <w:tcW w:type="dxa" w:w="2880"/>
+            <w:shd w:fill="F1F5F9" w:val="clear"/>
+          </w:tcPr>
+          <w:p>
+            <w:r>
+              <w:rPr>
+                <w:color w:val="1E293B"/>
+                <w:sz w:val="18"/>
+              </w:rPr>
+              <w:t>Visualisation graphique de l'avancement des phases finales (Poules, Quarts, Demies, Finale).</w:t>
+            </w:r>
+          </w:p>
+        </w:tc>
+        <w:tc>
+          <w:tcPr>
+            <w:tcW w:type="dxa" w:w="2880"/>
+            <w:shd w:fill="F1F5F9" w:val="clear"/>
+          </w:tcPr>
+          <w:p>
+            <w:r>
+              <w:rPr>
+                <w:color w:val="1E293B"/>
+                <w:sz w:val="18"/>
+              </w:rPr>
+              <w:t>Moyenne</w:t>
+            </w:r>
+          </w:p>
+        </w:tc>
+      </w:tr>
+      <w:tr>
+        <w:tc>
+          <w:tcPr>
+            <w:tcW w:type="dxa" w:w="2880"/>
+          </w:tcPr>
+          <w:p>
+            <w:r>
+              <w:rPr>
+                <w:color w:val="1E293B"/>
+                <w:sz w:val="18"/>
+              </w:rPr>
+              <w:t>Tableau de Bord</w:t>
+            </w:r>
+          </w:p>
+        </w:tc>
+        <w:tc>
+          <w:tcPr>
+            <w:tcW w:type="dxa" w:w="2880"/>
+          </w:tcPr>
+          <w:p>
+            <w:r>
+              <w:rPr>
+                <w:color w:val="1E293B"/>
+                <w:sz w:val="18"/>
+              </w:rPr>
+              <w:t>Vue d'ensemble avec KPIs, derniers resultats, prochains matchs et meilleurs buteurs.</w:t>
+            </w:r>
+          </w:p>
+        </w:tc>
+        <w:tc>
+          <w:tcPr>
+            <w:tcW w:type="dxa" w:w="2880"/>
+          </w:tcPr>
+          <w:p>
+            <w:r>
+              <w:rPr>
+                <w:color w:val="1E293B"/>
+                <w:sz w:val="18"/>
+              </w:rPr>
+              <w:t>Haute</w:t>
+            </w:r>
+          </w:p>
+        </w:tc>
+      </w:tr>
+      <w:tr>
+        <w:tc>
+          <w:tcPr>
+            <w:tcW w:type="dxa" w:w="2880"/>
+            <w:shd w:fill="F1F5F9" w:val="clear"/>
+          </w:tcPr>
+          <w:p>
+            <w:r>
+              <w:rPr>
+                <w:color w:val="1E293B"/>
+                <w:sz w:val="18"/>
+              </w:rPr>
+              <w:t>Gestion des Utilisateurs</w:t>
+            </w:r>
+          </w:p>
+        </w:tc>
+        <w:tc>
+          <w:tcPr>
+            <w:tcW w:type="dxa" w:w="2880"/>
+            <w:shd w:fill="F1F5F9" w:val="clear"/>
+          </w:tcPr>
+          <w:p>
+            <w:r>
+              <w:rPr>
+                <w:color w:val="1E293B"/>
+                <w:sz w:val="18"/>
+              </w:rPr>
+              <w:t>Administration des comptes staff avec attribution des roles et droits d'acces.</w:t>
+            </w:r>
+          </w:p>
+        </w:tc>
+        <w:tc>
+          <w:tcPr>
+            <w:tcW w:type="dxa" w:w="2880"/>
+            <w:shd w:fill="F1F5F9" w:val="clear"/>
+          </w:tcPr>
+          <w:p>
+            <w:r>
+              <w:rPr>
+                <w:color w:val="1E293B"/>
+                <w:sz w:val="18"/>
+              </w:rPr>
+              <w:t>Haute</w:t>
+            </w:r>
+          </w:p>
+        </w:tc>
+      </w:tr>
+      <w:tr>
+        <w:tc>
+          <w:tcPr>
+            <w:tcW w:type="dxa" w:w="2880"/>
+          </w:tcPr>
+          <w:p>
+            <w:r>
+              <w:rPr>
+                <w:color w:val="1E293B"/>
+                <w:sz w:val="18"/>
+              </w:rPr>
+              <w:t>Authentification</w:t>
+            </w:r>
+          </w:p>
+        </w:tc>
+        <w:tc>
+          <w:tcPr>
+            <w:tcW w:type="dxa" w:w="2880"/>
+          </w:tcPr>
+          <w:p>
+            <w:r>
+              <w:rPr>
+                <w:color w:val="1E293B"/>
+                <w:sz w:val="18"/>
+              </w:rPr>
+              <w:t>Systeme de connexion securise avec gestion de profil et reinitialisation de mot de passe.</w:t>
+            </w:r>
+          </w:p>
+        </w:tc>
+        <w:tc>
+          <w:tcPr>
+            <w:tcW w:type="dxa" w:w="2880"/>
+          </w:tcPr>
+          <w:p>
+            <w:r>
+              <w:rPr>
+                <w:color w:val="1E293B"/>
+                <w:sz w:val="18"/>
+              </w:rPr>
+              <w:t>Critique</w:t>
+            </w:r>
+          </w:p>
+        </w:tc>
+      </w:tr>
+    </w:tbl>
+    <w:p/>
+    <w:p>
+      <w:pPr>
+        <w:pStyle w:val="Heading1"/>
+      </w:pPr>
+      <w:r>
+        <w:t>2. Acteurs du Systeme</w:t>
+      </w:r>
+    </w:p>
+    <w:p>
+      <w:pPr>
+        <w:pStyle w:val="Heading2"/>
+      </w:pPr>
+      <w:r>
+        <w:t>2.1. Matrice des Droits d'Acces</w:t>
+      </w:r>
+    </w:p>
+    <w:tbl>
+      <w:tblPr>
+        <w:tblStyle w:val="TableGrid"/>
+        <w:tblW w:type="auto" w:w="0"/>
+        <w:jc w:val="center"/>
+        <w:tblLook w:firstColumn="1" w:firstRow="1" w:lastColumn="0" w:lastRow="0" w:noHBand="0" w:noVBand="1" w:val="04A0"/>
+      </w:tblPr>
+      <w:tblGrid>
+        <w:gridCol w:w="2160"/>
+        <w:gridCol w:w="2160"/>
+        <w:gridCol w:w="2160"/>
+        <w:gridCol w:w="2160"/>
+      </w:tblGrid>
+      <w:tr>
+        <w:tc>
+          <w:tcPr>
+            <w:tcW w:type="dxa" w:w="2160"/>
+            <w:shd w:fill="1A4BAD" w:val="clear"/>
+          </w:tcPr>
+          <w:p>
+            <w:pPr>
+              <w:jc w:val="center"/>
+            </w:pPr>
+            <w:r>
+              <w:rPr>
+                <w:b/>
+                <w:color w:val="FFFFFF"/>
+                <w:sz w:val="20"/>
+              </w:rPr>
+              <w:t>Fonctionnalite</w:t>
+            </w:r>
+          </w:p>
+        </w:tc>
+        <w:tc>
+          <w:tcPr>
+            <w:tcW w:type="dxa" w:w="2160"/>
+            <w:shd w:fill="1A4BAD" w:val="clear"/>
+          </w:tcPr>
+          <w:p>
+            <w:pPr>
+              <w:jc w:val="center"/>
+            </w:pPr>
+            <w:r>
+              <w:rPr>
+                <w:b/>
+                <w:color w:val="FFFFFF"/>
+                <w:sz w:val="20"/>
+              </w:rPr>
+              <w:t>Administrateur</w:t>
+            </w:r>
+          </w:p>
+        </w:tc>
+        <w:tc>
+          <w:tcPr>
+            <w:tcW w:type="dxa" w:w="2160"/>
+            <w:shd w:fill="1A4BAD" w:val="clear"/>
+          </w:tcPr>
+          <w:p>
+            <w:pPr>
+              <w:jc w:val="center"/>
+            </w:pPr>
+            <w:r>
+              <w:rPr>
+                <w:b/>
+                <w:color w:val="FFFFFF"/>
+                <w:sz w:val="20"/>
+              </w:rPr>
+              <w:t>Staff</w:t>
+            </w:r>
+          </w:p>
+        </w:tc>
+        <w:tc>
+          <w:tcPr>
+            <w:tcW w:type="dxa" w:w="2160"/>
+            <w:shd w:fill="1A4BAD" w:val="clear"/>
+          </w:tcPr>
+          <w:p>
+            <w:pPr>
+              <w:jc w:val="center"/>
+            </w:pPr>
+            <w:r>
+              <w:rPr>
+                <w:b/>
+                <w:color w:val="FFFFFF"/>
+                <w:sz w:val="20"/>
+              </w:rPr>
+              <w:t>Visiteur (connecte)</w:t>
+            </w:r>
+          </w:p>
+        </w:tc>
+      </w:tr>
+      <w:tr>
+        <w:tc>
+          <w:tcPr>
+            <w:tcW w:type="dxa" w:w="2160"/>
+          </w:tcPr>
+          <w:p>
+            <w:r>
+              <w:rPr>
+                <w:color w:val="1E293B"/>
+                <w:sz w:val="18"/>
+              </w:rPr>
+              <w:t>Consulter le tableau de bord</w:t>
+            </w:r>
+          </w:p>
+        </w:tc>
+        <w:tc>
+          <w:tcPr>
+            <w:tcW w:type="dxa" w:w="2160"/>
+          </w:tcPr>
+          <w:p>
+            <w:r>
+              <w:rPr>
+                <w:color w:val="1E293B"/>
+                <w:sz w:val="18"/>
+              </w:rPr>
+              <w:t>Oui</w:t>
+            </w:r>
+          </w:p>
+        </w:tc>
+        <w:tc>
+          <w:tcPr>
+            <w:tcW w:type="dxa" w:w="2160"/>
+          </w:tcPr>
+          <w:p>
+            <w:r>
+              <w:rPr>
+                <w:color w:val="1E293B"/>
+                <w:sz w:val="18"/>
+              </w:rPr>
+              <w:t>Oui</w:t>
+            </w:r>
+          </w:p>
+        </w:tc>
+        <w:tc>
+          <w:tcPr>
+            <w:tcW w:type="dxa" w:w="2160"/>
+          </w:tcPr>
+          <w:p>
+            <w:r>
+              <w:rPr>
+                <w:color w:val="1E293B"/>
+                <w:sz w:val="18"/>
+              </w:rPr>
+              <w:t>Oui</w:t>
+            </w:r>
+          </w:p>
+        </w:tc>
+      </w:tr>
+      <w:tr>
+        <w:tc>
+          <w:tcPr>
+            <w:tcW w:type="dxa" w:w="2160"/>
+            <w:shd w:fill="F1F5F9" w:val="clear"/>
+          </w:tcPr>
+          <w:p>
+            <w:r>
+              <w:rPr>
+                <w:color w:val="1E293B"/>
+                <w:sz w:val="18"/>
+              </w:rPr>
+              <w:t>Consulter les classements</w:t>
+            </w:r>
+          </w:p>
+        </w:tc>
+        <w:tc>
+          <w:tcPr>
+            <w:tcW w:type="dxa" w:w="2160"/>
+            <w:shd w:fill="F1F5F9" w:val="clear"/>
+          </w:tcPr>
+          <w:p>
+            <w:r>
+              <w:rPr>
+                <w:color w:val="1E293B"/>
+                <w:sz w:val="18"/>
+              </w:rPr>
+              <w:t>Oui</w:t>
+            </w:r>
+          </w:p>
+        </w:tc>
+        <w:tc>
+          <w:tcPr>
+            <w:tcW w:type="dxa" w:w="2160"/>
+            <w:shd w:fill="F1F5F9" w:val="clear"/>
+          </w:tcPr>
+          <w:p>
+            <w:r>
+              <w:rPr>
+                <w:color w:val="1E293B"/>
+                <w:sz w:val="18"/>
+              </w:rPr>
+              <w:t>Oui</w:t>
+            </w:r>
+          </w:p>
+        </w:tc>
+        <w:tc>
+          <w:tcPr>
+            <w:tcW w:type="dxa" w:w="2160"/>
+            <w:shd w:fill="F1F5F9" w:val="clear"/>
+          </w:tcPr>
+          <w:p>
+            <w:r>
+              <w:rPr>
+                <w:color w:val="1E293B"/>
+                <w:sz w:val="18"/>
+              </w:rPr>
+              <w:t>Oui</w:t>
+            </w:r>
+          </w:p>
+        </w:tc>
+      </w:tr>
+      <w:tr>
+        <w:tc>
+          <w:tcPr>
+            <w:tcW w:type="dxa" w:w="2160"/>
+          </w:tcPr>
+          <w:p>
+            <w:r>
+              <w:rPr>
+                <w:color w:val="1E293B"/>
+                <w:sz w:val="18"/>
+              </w:rPr>
+              <w:t>Consulter l'arbre du tournoi</w:t>
+            </w:r>
+          </w:p>
+        </w:tc>
+        <w:tc>
+          <w:tcPr>
+            <w:tcW w:type="dxa" w:w="2160"/>
+          </w:tcPr>
+          <w:p>
+            <w:r>
+              <w:rPr>
+                <w:color w:val="1E293B"/>
+                <w:sz w:val="18"/>
+              </w:rPr>
+              <w:t>Oui</w:t>
+            </w:r>
+          </w:p>
+        </w:tc>
+        <w:tc>
+          <w:tcPr>
+            <w:tcW w:type="dxa" w:w="2160"/>
+          </w:tcPr>
+          <w:p>
+            <w:r>
+              <w:rPr>
+                <w:color w:val="1E293B"/>
+                <w:sz w:val="18"/>
+              </w:rPr>
+              <w:t>Oui</w:t>
+            </w:r>
+          </w:p>
+        </w:tc>
+        <w:tc>
+          <w:tcPr>
+            <w:tcW w:type="dxa" w:w="2160"/>
+          </w:tcPr>
+          <w:p>
+            <w:r>
+              <w:rPr>
+                <w:color w:val="1E293B"/>
+                <w:sz w:val="18"/>
+              </w:rPr>
+              <w:t>Oui</w:t>
+            </w:r>
+          </w:p>
+        </w:tc>
+      </w:tr>
+      <w:tr>
+        <w:tc>
+          <w:tcPr>
+            <w:tcW w:type="dxa" w:w="2160"/>
+            <w:shd w:fill="F1F5F9" w:val="clear"/>
+          </w:tcPr>
+          <w:p>
+            <w:r>
+              <w:rPr>
+                <w:color w:val="1E293B"/>
+                <w:sz w:val="18"/>
+              </w:rPr>
+              <w:t>Voir les details d'un match</w:t>
+            </w:r>
+          </w:p>
+        </w:tc>
+        <w:tc>
+          <w:tcPr>
+            <w:tcW w:type="dxa" w:w="2160"/>
+            <w:shd w:fill="F1F5F9" w:val="clear"/>
+          </w:tcPr>
+          <w:p>
+            <w:r>
+              <w:rPr>
+                <w:color w:val="1E293B"/>
+                <w:sz w:val="18"/>
+              </w:rPr>
+              <w:t>Oui</w:t>
+            </w:r>
+          </w:p>
+        </w:tc>
+        <w:tc>
+          <w:tcPr>
+            <w:tcW w:type="dxa" w:w="2160"/>
+            <w:shd w:fill="F1F5F9" w:val="clear"/>
+          </w:tcPr>
+          <w:p>
+            <w:r>
+              <w:rPr>
+                <w:color w:val="1E293B"/>
+                <w:sz w:val="18"/>
+              </w:rPr>
+              <w:t>Oui</w:t>
+            </w:r>
+          </w:p>
+        </w:tc>
+        <w:tc>
+          <w:tcPr>
+            <w:tcW w:type="dxa" w:w="2160"/>
+            <w:shd w:fill="F1F5F9" w:val="clear"/>
+          </w:tcPr>
+          <w:p>
+            <w:r>
+              <w:rPr>
+                <w:color w:val="1E293B"/>
+                <w:sz w:val="18"/>
+              </w:rPr>
+              <w:t>Oui</w:t>
+            </w:r>
+          </w:p>
+        </w:tc>
+      </w:tr>
+      <w:tr>
+        <w:tc>
+          <w:tcPr>
+            <w:tcW w:type="dxa" w:w="2160"/>
+          </w:tcPr>
+          <w:p>
+            <w:r>
+              <w:rPr>
+                <w:color w:val="1E293B"/>
+                <w:sz w:val="18"/>
+              </w:rPr>
+              <w:t>Creer/Modifier/Supprimer une Edition</w:t>
+            </w:r>
+          </w:p>
+        </w:tc>
+        <w:tc>
+          <w:tcPr>
+            <w:tcW w:type="dxa" w:w="2160"/>
+          </w:tcPr>
+          <w:p>
+            <w:r>
+              <w:rPr>
+                <w:color w:val="1E293B"/>
+                <w:sz w:val="18"/>
+              </w:rPr>
+              <w:t>Oui</w:t>
+            </w:r>
+          </w:p>
+        </w:tc>
+        <w:tc>
+          <w:tcPr>
+            <w:tcW w:type="dxa" w:w="2160"/>
+          </w:tcPr>
+          <w:p>
+            <w:r>
+              <w:rPr>
+                <w:color w:val="1E293B"/>
+                <w:sz w:val="18"/>
+              </w:rPr>
+              <w:t>Non</w:t>
+            </w:r>
+          </w:p>
+        </w:tc>
+        <w:tc>
+          <w:tcPr>
+            <w:tcW w:type="dxa" w:w="2160"/>
+          </w:tcPr>
+          <w:p>
+            <w:r>
+              <w:rPr>
+                <w:color w:val="1E293B"/>
+                <w:sz w:val="18"/>
+              </w:rPr>
+              <w:t>Non</w:t>
+            </w:r>
+          </w:p>
+        </w:tc>
+      </w:tr>
+      <w:tr>
+        <w:tc>
+          <w:tcPr>
+            <w:tcW w:type="dxa" w:w="2160"/>
+            <w:shd w:fill="F1F5F9" w:val="clear"/>
+          </w:tcPr>
+          <w:p>
+            <w:r>
+              <w:rPr>
+                <w:color w:val="1E293B"/>
+                <w:sz w:val="18"/>
+              </w:rPr>
+              <w:t>Creer/Modifier/Supprimer une Faculte</w:t>
+            </w:r>
+          </w:p>
+        </w:tc>
+        <w:tc>
+          <w:tcPr>
+            <w:tcW w:type="dxa" w:w="2160"/>
+            <w:shd w:fill="F1F5F9" w:val="clear"/>
+          </w:tcPr>
+          <w:p>
+            <w:r>
+              <w:rPr>
+                <w:color w:val="1E293B"/>
+                <w:sz w:val="18"/>
+              </w:rPr>
+              <w:t>Oui</w:t>
+            </w:r>
+          </w:p>
+        </w:tc>
+        <w:tc>
+          <w:tcPr>
+            <w:tcW w:type="dxa" w:w="2160"/>
+            <w:shd w:fill="F1F5F9" w:val="clear"/>
+          </w:tcPr>
+          <w:p>
+            <w:r>
+              <w:rPr>
+                <w:color w:val="1E293B"/>
+                <w:sz w:val="18"/>
+              </w:rPr>
+              <w:t>Non</w:t>
+            </w:r>
+          </w:p>
+        </w:tc>
+        <w:tc>
+          <w:tcPr>
+            <w:tcW w:type="dxa" w:w="2160"/>
+            <w:shd w:fill="F1F5F9" w:val="clear"/>
+          </w:tcPr>
+          <w:p>
+            <w:r>
+              <w:rPr>
+                <w:color w:val="1E293B"/>
+                <w:sz w:val="18"/>
+              </w:rPr>
+              <w:t>Non</w:t>
+            </w:r>
+          </w:p>
+        </w:tc>
+      </w:tr>
+      <w:tr>
+        <w:tc>
+          <w:tcPr>
+            <w:tcW w:type="dxa" w:w="2160"/>
+          </w:tcPr>
+          <w:p>
+            <w:r>
+              <w:rPr>
+                <w:color w:val="1E293B"/>
+                <w:sz w:val="18"/>
+              </w:rPr>
+              <w:t>Creer/Modifier/Supprimer une Discipline</w:t>
+            </w:r>
+          </w:p>
+        </w:tc>
+        <w:tc>
+          <w:tcPr>
+            <w:tcW w:type="dxa" w:w="2160"/>
+          </w:tcPr>
+          <w:p>
+            <w:r>
+              <w:rPr>
+                <w:color w:val="1E293B"/>
+                <w:sz w:val="18"/>
+              </w:rPr>
+              <w:t>Oui</w:t>
+            </w:r>
+          </w:p>
+        </w:tc>
+        <w:tc>
+          <w:tcPr>
+            <w:tcW w:type="dxa" w:w="2160"/>
+          </w:tcPr>
+          <w:p>
+            <w:r>
+              <w:rPr>
+                <w:color w:val="1E293B"/>
+                <w:sz w:val="18"/>
+              </w:rPr>
+              <w:t>Non</w:t>
+            </w:r>
+          </w:p>
+        </w:tc>
+        <w:tc>
+          <w:tcPr>
+            <w:tcW w:type="dxa" w:w="2160"/>
+          </w:tcPr>
+          <w:p>
+            <w:r>
+              <w:rPr>
+                <w:color w:val="1E293B"/>
+                <w:sz w:val="18"/>
+              </w:rPr>
+              <w:t>Non</w:t>
+            </w:r>
+          </w:p>
+        </w:tc>
+      </w:tr>
+      <w:tr>
+        <w:tc>
+          <w:tcPr>
+            <w:tcW w:type="dxa" w:w="2160"/>
+            <w:shd w:fill="F1F5F9" w:val="clear"/>
+          </w:tcPr>
+          <w:p>
+            <w:r>
+              <w:rPr>
+                <w:color w:val="1E293B"/>
+                <w:sz w:val="18"/>
+              </w:rPr>
+              <w:t>Creer/Modifier/Supprimer une Equipe</w:t>
+            </w:r>
+          </w:p>
+        </w:tc>
+        <w:tc>
+          <w:tcPr>
+            <w:tcW w:type="dxa" w:w="2160"/>
+            <w:shd w:fill="F1F5F9" w:val="clear"/>
+          </w:tcPr>
+          <w:p>
+            <w:r>
+              <w:rPr>
+                <w:color w:val="1E293B"/>
+                <w:sz w:val="18"/>
+              </w:rPr>
+              <w:t>Oui</w:t>
+            </w:r>
+          </w:p>
+        </w:tc>
+        <w:tc>
+          <w:tcPr>
+            <w:tcW w:type="dxa" w:w="2160"/>
+            <w:shd w:fill="F1F5F9" w:val="clear"/>
+          </w:tcPr>
+          <w:p>
+            <w:r>
+              <w:rPr>
+                <w:color w:val="1E293B"/>
+                <w:sz w:val="18"/>
+              </w:rPr>
+              <w:t>Non</w:t>
+            </w:r>
+          </w:p>
+        </w:tc>
+        <w:tc>
+          <w:tcPr>
+            <w:tcW w:type="dxa" w:w="2160"/>
+            <w:shd w:fill="F1F5F9" w:val="clear"/>
+          </w:tcPr>
+          <w:p>
+            <w:r>
+              <w:rPr>
+                <w:color w:val="1E293B"/>
+                <w:sz w:val="18"/>
+              </w:rPr>
+              <w:t>Non</w:t>
+            </w:r>
+          </w:p>
+        </w:tc>
+      </w:tr>
+      <w:tr>
+        <w:tc>
+          <w:tcPr>
+            <w:tcW w:type="dxa" w:w="2160"/>
+          </w:tcPr>
+          <w:p>
+            <w:r>
+              <w:rPr>
+                <w:color w:val="1E293B"/>
+                <w:sz w:val="18"/>
+              </w:rPr>
+              <w:t>Creer/Modifier un Joueur</w:t>
+            </w:r>
+          </w:p>
+        </w:tc>
+        <w:tc>
+          <w:tcPr>
+            <w:tcW w:type="dxa" w:w="2160"/>
+          </w:tcPr>
+          <w:p>
+            <w:r>
+              <w:rPr>
+                <w:color w:val="1E293B"/>
+                <w:sz w:val="18"/>
+              </w:rPr>
+              <w:t>Oui</w:t>
+            </w:r>
+          </w:p>
+        </w:tc>
+        <w:tc>
+          <w:tcPr>
+            <w:tcW w:type="dxa" w:w="2160"/>
+          </w:tcPr>
+          <w:p>
+            <w:r>
+              <w:rPr>
+                <w:color w:val="1E293B"/>
+                <w:sz w:val="18"/>
+              </w:rPr>
+              <w:t>Oui</w:t>
+            </w:r>
+          </w:p>
+        </w:tc>
+        <w:tc>
+          <w:tcPr>
+            <w:tcW w:type="dxa" w:w="2160"/>
+          </w:tcPr>
+          <w:p>
+            <w:r>
+              <w:rPr>
+                <w:color w:val="1E293B"/>
+                <w:sz w:val="18"/>
+              </w:rPr>
+              <w:t>Non</w:t>
+            </w:r>
+          </w:p>
+        </w:tc>
+      </w:tr>
+      <w:tr>
+        <w:tc>
+          <w:tcPr>
+            <w:tcW w:type="dxa" w:w="2160"/>
+            <w:shd w:fill="F1F5F9" w:val="clear"/>
+          </w:tcPr>
+          <w:p>
+            <w:r>
+              <w:rPr>
+                <w:color w:val="1E293B"/>
+                <w:sz w:val="18"/>
+              </w:rPr>
+              <w:t>Supprimer un Joueur</w:t>
+            </w:r>
+          </w:p>
+        </w:tc>
+        <w:tc>
+          <w:tcPr>
+            <w:tcW w:type="dxa" w:w="2160"/>
+            <w:shd w:fill="F1F5F9" w:val="clear"/>
+          </w:tcPr>
+          <w:p>
+            <w:r>
+              <w:rPr>
+                <w:color w:val="1E293B"/>
+                <w:sz w:val="18"/>
+              </w:rPr>
+              <w:t>Oui</w:t>
+            </w:r>
+          </w:p>
+        </w:tc>
+        <w:tc>
+          <w:tcPr>
+            <w:tcW w:type="dxa" w:w="2160"/>
+            <w:shd w:fill="F1F5F9" w:val="clear"/>
+          </w:tcPr>
+          <w:p>
+            <w:r>
+              <w:rPr>
+                <w:color w:val="1E293B"/>
+                <w:sz w:val="18"/>
+              </w:rPr>
+              <w:t>Oui</w:t>
+            </w:r>
+          </w:p>
+        </w:tc>
+        <w:tc>
+          <w:tcPr>
+            <w:tcW w:type="dxa" w:w="2160"/>
+            <w:shd w:fill="F1F5F9" w:val="clear"/>
+          </w:tcPr>
+          <w:p>
+            <w:r>
+              <w:rPr>
+                <w:color w:val="1E293B"/>
+                <w:sz w:val="18"/>
+              </w:rPr>
+              <w:t>Non</w:t>
+            </w:r>
+          </w:p>
+        </w:tc>
+      </w:tr>
+      <w:tr>
+        <w:tc>
+          <w:tcPr>
+            <w:tcW w:type="dxa" w:w="2160"/>
+          </w:tcPr>
+          <w:p>
+            <w:r>
+              <w:rPr>
+                <w:color w:val="1E293B"/>
+                <w:sz w:val="18"/>
+              </w:rPr>
+              <w:t>Programmer un Match</w:t>
+            </w:r>
+          </w:p>
+        </w:tc>
+        <w:tc>
+          <w:tcPr>
+            <w:tcW w:type="dxa" w:w="2160"/>
+          </w:tcPr>
+          <w:p>
+            <w:r>
+              <w:rPr>
+                <w:color w:val="1E293B"/>
+                <w:sz w:val="18"/>
+              </w:rPr>
+              <w:t>Oui</w:t>
+            </w:r>
+          </w:p>
+        </w:tc>
+        <w:tc>
+          <w:tcPr>
+            <w:tcW w:type="dxa" w:w="2160"/>
+          </w:tcPr>
+          <w:p>
+            <w:r>
+              <w:rPr>
+                <w:color w:val="1E293B"/>
+                <w:sz w:val="18"/>
+              </w:rPr>
+              <w:t>Oui</w:t>
+            </w:r>
+          </w:p>
+        </w:tc>
+        <w:tc>
+          <w:tcPr>
+            <w:tcW w:type="dxa" w:w="2160"/>
+          </w:tcPr>
+          <w:p>
+            <w:r>
+              <w:rPr>
+                <w:color w:val="1E293B"/>
+                <w:sz w:val="18"/>
+              </w:rPr>
+              <w:t>Non</w:t>
+            </w:r>
+          </w:p>
+        </w:tc>
+      </w:tr>
+      <w:tr>
+        <w:tc>
+          <w:tcPr>
+            <w:tcW w:type="dxa" w:w="2160"/>
+            <w:shd w:fill="F1F5F9" w:val="clear"/>
+          </w:tcPr>
+          <w:p>
+            <w:r>
+              <w:rPr>
+                <w:color w:val="1E293B"/>
+                <w:sz w:val="18"/>
+              </w:rPr>
+              <w:t>Saisir le score d'un Match</w:t>
+            </w:r>
+          </w:p>
+        </w:tc>
+        <w:tc>
+          <w:tcPr>
+            <w:tcW w:type="dxa" w:w="2160"/>
+            <w:shd w:fill="F1F5F9" w:val="clear"/>
+          </w:tcPr>
+          <w:p>
+            <w:r>
+              <w:rPr>
+                <w:color w:val="1E293B"/>
+                <w:sz w:val="18"/>
+              </w:rPr>
+              <w:t>Oui</w:t>
+            </w:r>
+          </w:p>
+        </w:tc>
+        <w:tc>
+          <w:tcPr>
+            <w:tcW w:type="dxa" w:w="2160"/>
+            <w:shd w:fill="F1F5F9" w:val="clear"/>
+          </w:tcPr>
+          <w:p>
+            <w:r>
+              <w:rPr>
+                <w:color w:val="1E293B"/>
+                <w:sz w:val="18"/>
+              </w:rPr>
+              <w:t>Oui</w:t>
+            </w:r>
+          </w:p>
+        </w:tc>
+        <w:tc>
+          <w:tcPr>
+            <w:tcW w:type="dxa" w:w="2160"/>
+            <w:shd w:fill="F1F5F9" w:val="clear"/>
+          </w:tcPr>
+          <w:p>
+            <w:r>
+              <w:rPr>
+                <w:color w:val="1E293B"/>
+                <w:sz w:val="18"/>
+              </w:rPr>
+              <w:t>Non</w:t>
+            </w:r>
+          </w:p>
+        </w:tc>
+      </w:tr>
+      <w:tr>
+        <w:tc>
+          <w:tcPr>
+            <w:tcW w:type="dxa" w:w="2160"/>
+          </w:tcPr>
+          <w:p>
+            <w:r>
+              <w:rPr>
+                <w:color w:val="1E293B"/>
+                <w:sz w:val="18"/>
+              </w:rPr>
+              <w:t>Supprimer un Match</w:t>
+            </w:r>
+          </w:p>
+        </w:tc>
+        <w:tc>
+          <w:tcPr>
+            <w:tcW w:type="dxa" w:w="2160"/>
+          </w:tcPr>
+          <w:p>
+            <w:r>
+              <w:rPr>
+                <w:color w:val="1E293B"/>
+                <w:sz w:val="18"/>
+              </w:rPr>
+              <w:t>Oui</w:t>
+            </w:r>
+          </w:p>
+        </w:tc>
+        <w:tc>
+          <w:tcPr>
+            <w:tcW w:type="dxa" w:w="2160"/>
+          </w:tcPr>
+          <w:p>
+            <w:r>
+              <w:rPr>
+                <w:color w:val="1E293B"/>
+                <w:sz w:val="18"/>
+              </w:rPr>
+              <w:t>Oui</w:t>
+            </w:r>
+          </w:p>
+        </w:tc>
+        <w:tc>
+          <w:tcPr>
+            <w:tcW w:type="dxa" w:w="2160"/>
+          </w:tcPr>
+          <w:p>
+            <w:r>
+              <w:rPr>
+                <w:color w:val="1E293B"/>
+                <w:sz w:val="18"/>
+              </w:rPr>
+              <w:t>Non</w:t>
+            </w:r>
+          </w:p>
+        </w:tc>
+      </w:tr>
+      <w:tr>
+        <w:tc>
+          <w:tcPr>
+            <w:tcW w:type="dxa" w:w="2160"/>
+            <w:shd w:fill="F1F5F9" w:val="clear"/>
+          </w:tcPr>
+          <w:p>
+            <w:r>
+              <w:rPr>
+                <w:color w:val="1E293B"/>
+                <w:sz w:val="18"/>
+              </w:rPr>
+              <w:t>Gerer les comptes utilisateurs</w:t>
+            </w:r>
+          </w:p>
+        </w:tc>
+        <w:tc>
+          <w:tcPr>
+            <w:tcW w:type="dxa" w:w="2160"/>
+            <w:shd w:fill="F1F5F9" w:val="clear"/>
+          </w:tcPr>
+          <w:p>
+            <w:r>
+              <w:rPr>
+                <w:color w:val="1E293B"/>
+                <w:sz w:val="18"/>
+              </w:rPr>
+              <w:t>Oui</w:t>
+            </w:r>
+          </w:p>
+        </w:tc>
+        <w:tc>
+          <w:tcPr>
+            <w:tcW w:type="dxa" w:w="2160"/>
+            <w:shd w:fill="F1F5F9" w:val="clear"/>
+          </w:tcPr>
+          <w:p>
+            <w:r>
+              <w:rPr>
+                <w:color w:val="1E293B"/>
+                <w:sz w:val="18"/>
+              </w:rPr>
+              <w:t>Non</w:t>
+            </w:r>
+          </w:p>
+        </w:tc>
+        <w:tc>
+          <w:tcPr>
+            <w:tcW w:type="dxa" w:w="2160"/>
+            <w:shd w:fill="F1F5F9" w:val="clear"/>
+          </w:tcPr>
+          <w:p>
+            <w:r>
+              <w:rPr>
+                <w:color w:val="1E293B"/>
+                <w:sz w:val="18"/>
+              </w:rPr>
+              <w:t>Non</w:t>
+            </w:r>
+          </w:p>
+        </w:tc>
+      </w:tr>
+    </w:tbl>
+    <w:p/>
+    <w:p>
+      <w:pPr>
+        <w:pStyle w:val="Heading2"/>
+      </w:pPr>
+      <w:r>
+        <w:t>2.2. Description Detaillee des Roles</w:t>
+      </w:r>
+    </w:p>
+    <w:p>
+      <w:r>
+        <w:rPr>
+          <w:b/>
+          <w:color w:val="1E293B"/>
+        </w:rPr>
+        <w:t xml:space="preserve">Administrateur : </w:t>
+      </w:r>
+      <w:r>
+        <w:rPr>
+          <w:color w:val="64748B"/>
+        </w:rPr>
+        <w:t>Dispose de l'acces complet a toutes les fonctionnalites de la plateforme. Il est responsable de la creation des editions, de l'ajout des facultes et disciplines, de la configuration des equipes et de la gestion des comptes utilisateurs. Il est le seul a pouvoir supprimer des entites majeures (editions, facultes, disciplines, equipes). Il peut egalement effectuer toutes les operations devolues au Staff.</w:t>
+      </w:r>
+    </w:p>
+    <w:p>
+      <w:r>
+        <w:rPr>
+          <w:b/>
+          <w:color w:val="1E293B"/>
+        </w:rPr>
+        <w:t xml:space="preserve">Staff : </w:t>
+      </w:r>
+      <w:r>
+        <w:rPr>
+          <w:color w:val="64748B"/>
+        </w:rPr>
+        <w:t>Personnel de l'organisation du tournoi. Il peut creer et modifier des joueurs, programmer des matchs, saisir les scores et les buteurs. Il ne peut pas acceder aux fonctions d'administration systeme (gestion des utilisateurs) ni supprimer des entites structurelles.</w:t>
+      </w:r>
+    </w:p>
+    <w:p>
+      <w:r>
+        <w:rPr>
+          <w:b/>
+          <w:color w:val="1E293B"/>
+        </w:rPr>
+        <w:t xml:space="preserve">Visiteur connecte : </w:t>
+      </w:r>
+      <w:r>
+        <w:rPr>
+          <w:color w:val="64748B"/>
+        </w:rPr>
+        <w:t>Tout utilisateur authentifie ne disposant pas de role specifique. Il beneficie d'un acces en lecture seule a l'ensemble des donnees publiques : tableau de bord, classements, calendrier des matchs, arbre du tournoi.</w:t>
       </w:r>
     </w:p>
     <w:p>
@@ -99,12 +1946,15 @@
         <w:pStyle w:val="Heading1"/>
       </w:pPr>
       <w:r>
-        <w:t>2. Périmètre Fonctionnel</w:t>
+        <w:t>3. Exigences Non-Fonctionnelles</w:t>
       </w:r>
     </w:p>
     <w:p>
+      <w:pPr>
+        <w:pStyle w:val="Heading2"/>
+      </w:pPr>
       <w:r>
-        <w:t>Le système couvre les domaines suivants :</w:t>
+        <w:t>3.1. Performance</w:t>
       </w:r>
     </w:p>
     <w:p>
@@ -112,7 +1962,7 @@
         <w:pStyle w:val="ListBullet"/>
       </w:pPr>
       <w:r>
-        <w:t>Gestion des Éditions (Tournois annuels)</w:t>
+        <w:t>Le temps de reponse moyen pour l'affichage d'une page ne doit pas exceder 2 secondes en conditions normales d'utilisation.</w:t>
       </w:r>
     </w:p>
     <w:p>
@@ -120,7 +1970,7 @@
         <w:pStyle w:val="ListBullet"/>
       </w:pPr>
       <w:r>
-        <w:t>Gestion des Facultés et Universités participantes</w:t>
+        <w:t>La plateforme doit supporter au minimum 50 utilisateurs simultanement connectes.</w:t>
       </w:r>
     </w:p>
     <w:p>
@@ -128,7 +1978,15 @@
         <w:pStyle w:val="ListBullet"/>
       </w:pPr>
       <w:r>
-        <w:t>Gestion des Disciplines Sportives</w:t>
+        <w:t>Les calculs de classement doivent etre effectues en temps reel, sans cache, pour garantir la fraicheur des donnees.</w:t>
+      </w:r>
+    </w:p>
+    <w:p>
+      <w:pPr>
+        <w:pStyle w:val="Heading2"/>
+      </w:pPr>
+      <w:r>
+        <w:t>3.2. Securite</w:t>
       </w:r>
     </w:p>
     <w:p>
@@ -136,7 +1994,7 @@
         <w:pStyle w:val="ListBullet"/>
       </w:pPr>
       <w:r>
-        <w:t>Gestion des Équipes et de leurs Joueurs</w:t>
+        <w:t>Authentification par email et mot de passe avec hashage bcrypt.</w:t>
       </w:r>
     </w:p>
     <w:p>
@@ -144,7 +2002,7 @@
         <w:pStyle w:val="ListBullet"/>
       </w:pPr>
       <w:r>
-        <w:t>Gestion du Calendrier des Matchs et Saisie des Scores</w:t>
+        <w:t>Protection CSRF sur tous les formulaires (token Laravel natif).</w:t>
       </w:r>
     </w:p>
     <w:p>
@@ -152,7 +2010,87 @@
         <w:pStyle w:val="ListBullet"/>
       </w:pPr>
       <w:r>
-        <w:t>Génération Automatique des Classements et de l'Arbre du Tournoi</w:t>
+        <w:t>Middleware de controle d'acces par role sur chaque groupe de routes.</w:t>
+      </w:r>
+    </w:p>
+    <w:p>
+      <w:pPr>
+        <w:pStyle w:val="ListBullet"/>
+      </w:pPr>
+      <w:r>
+        <w:t>Validation cote serveur de toutes les entrees utilisateur.</w:t>
+      </w:r>
+    </w:p>
+    <w:p>
+      <w:pPr>
+        <w:pStyle w:val="Heading2"/>
+      </w:pPr>
+      <w:r>
+        <w:t>3.3. Ergonomie et Accessibilite</w:t>
+      </w:r>
+    </w:p>
+    <w:p>
+      <w:pPr>
+        <w:pStyle w:val="ListBullet"/>
+      </w:pPr>
+      <w:r>
+        <w:t>Interface responsive adaptee aux ecrans desktop, tablette et mobile.</w:t>
+      </w:r>
+    </w:p>
+    <w:p>
+      <w:pPr>
+        <w:pStyle w:val="ListBullet"/>
+      </w:pPr>
+      <w:r>
+        <w:t>Design moderne utilisant un systeme de design unifie (enterprise-card, enterprise-btn, enterprise-input).</w:t>
+      </w:r>
+    </w:p>
+    <w:p>
+      <w:pPr>
+        <w:pStyle w:val="ListBullet"/>
+      </w:pPr>
+      <w:r>
+        <w:t>Recherche en temps reel sur toutes les listes (Alpine.js).</w:t>
+      </w:r>
+    </w:p>
+    <w:p>
+      <w:pPr>
+        <w:pStyle w:val="ListBullet"/>
+      </w:pPr>
+      <w:r>
+        <w:t>Retours visuels immediats (messages de succes, confirmation avant suppression).</w:t>
+      </w:r>
+    </w:p>
+    <w:p>
+      <w:pPr>
+        <w:pStyle w:val="Heading2"/>
+      </w:pPr>
+      <w:r>
+        <w:t>3.4. Maintenabilite</w:t>
+      </w:r>
+    </w:p>
+    <w:p>
+      <w:pPr>
+        <w:pStyle w:val="ListBullet"/>
+      </w:pPr>
+      <w:r>
+        <w:t>Architecture MVC stricte (Laravel). Separation claire des responsabilites.</w:t>
+      </w:r>
+    </w:p>
+    <w:p>
+      <w:pPr>
+        <w:pStyle w:val="ListBullet"/>
+      </w:pPr>
+      <w:r>
+        <w:t>Code source versionne avec Git, heberge sur GitHub.</w:t>
+      </w:r>
+    </w:p>
+    <w:p>
+      <w:pPr>
+        <w:pStyle w:val="ListBullet"/>
+      </w:pPr>
+      <w:r>
+        <w:t>Seeders fournis pour l'initialisation rapide d'un environnement de test avec donnees realistes.</w:t>
       </w:r>
     </w:p>
     <w:p>
@@ -160,33 +2098,581 @@
         <w:pStyle w:val="Heading1"/>
       </w:pPr>
       <w:r>
-        <w:t>3. Acteurs et Droits</w:t>
+        <w:t>4. Contraintes Techniques</w:t>
       </w:r>
     </w:p>
-    <w:p>
-      <w:pPr>
-        <w:pStyle w:val="ListBullet"/>
-      </w:pPr>
-      <w:r>
-        <w:t>Administrateur : Accès total. Peut créer, modifier, supprimer toutes les entités.</w:t>
-      </w:r>
-    </w:p>
-    <w:p>
-      <w:pPr>
-        <w:pStyle w:val="ListBullet"/>
-      </w:pPr>
-      <w:r>
-        <w:t>Staff : Accès en lecture et modification (saisie des scores), mais ne peut pas supprimer d'entités majeures.</w:t>
-      </w:r>
-    </w:p>
-    <w:p>
-      <w:pPr>
-        <w:pStyle w:val="ListBullet"/>
-      </w:pPr>
-      <w:r>
-        <w:t>Visiteur : Accès en lecture seule aux tableaux de bord, classements et plannings.</w:t>
-      </w:r>
-    </w:p>
+    <w:tbl>
+      <w:tblPr>
+        <w:tblStyle w:val="TableGrid"/>
+        <w:tblW w:type="auto" w:w="0"/>
+        <w:jc w:val="center"/>
+        <w:tblLook w:firstColumn="1" w:firstRow="1" w:lastColumn="0" w:lastRow="0" w:noHBand="0" w:noVBand="1" w:val="04A0"/>
+      </w:tblPr>
+      <w:tblGrid>
+        <w:gridCol w:w="2880"/>
+        <w:gridCol w:w="2880"/>
+        <w:gridCol w:w="2880"/>
+      </w:tblGrid>
+      <w:tr>
+        <w:tc>
+          <w:tcPr>
+            <w:tcW w:type="dxa" w:w="2880"/>
+            <w:shd w:fill="1A4BAD" w:val="clear"/>
+          </w:tcPr>
+          <w:p>
+            <w:pPr>
+              <w:jc w:val="center"/>
+            </w:pPr>
+            <w:r>
+              <w:rPr>
+                <w:b/>
+                <w:color w:val="FFFFFF"/>
+                <w:sz w:val="20"/>
+              </w:rPr>
+              <w:t>Composant</w:t>
+            </w:r>
+          </w:p>
+        </w:tc>
+        <w:tc>
+          <w:tcPr>
+            <w:tcW w:type="dxa" w:w="2880"/>
+            <w:shd w:fill="1A4BAD" w:val="clear"/>
+          </w:tcPr>
+          <w:p>
+            <w:pPr>
+              <w:jc w:val="center"/>
+            </w:pPr>
+            <w:r>
+              <w:rPr>
+                <w:b/>
+                <w:color w:val="FFFFFF"/>
+                <w:sz w:val="20"/>
+              </w:rPr>
+              <w:t>Technologie</w:t>
+            </w:r>
+          </w:p>
+        </w:tc>
+        <w:tc>
+          <w:tcPr>
+            <w:tcW w:type="dxa" w:w="2880"/>
+            <w:shd w:fill="1A4BAD" w:val="clear"/>
+          </w:tcPr>
+          <w:p>
+            <w:pPr>
+              <w:jc w:val="center"/>
+            </w:pPr>
+            <w:r>
+              <w:rPr>
+                <w:b/>
+                <w:color w:val="FFFFFF"/>
+                <w:sz w:val="20"/>
+              </w:rPr>
+              <w:t>Version</w:t>
+            </w:r>
+          </w:p>
+        </w:tc>
+      </w:tr>
+      <w:tr>
+        <w:tc>
+          <w:tcPr>
+            <w:tcW w:type="dxa" w:w="2880"/>
+          </w:tcPr>
+          <w:p>
+            <w:r>
+              <w:rPr>
+                <w:color w:val="1E293B"/>
+                <w:sz w:val="18"/>
+              </w:rPr>
+              <w:t>Langage Backend</w:t>
+            </w:r>
+          </w:p>
+        </w:tc>
+        <w:tc>
+          <w:tcPr>
+            <w:tcW w:type="dxa" w:w="2880"/>
+          </w:tcPr>
+          <w:p>
+            <w:r>
+              <w:rPr>
+                <w:color w:val="1E293B"/>
+                <w:sz w:val="18"/>
+              </w:rPr>
+              <w:t>PHP</w:t>
+            </w:r>
+          </w:p>
+        </w:tc>
+        <w:tc>
+          <w:tcPr>
+            <w:tcW w:type="dxa" w:w="2880"/>
+          </w:tcPr>
+          <w:p>
+            <w:r>
+              <w:rPr>
+                <w:color w:val="1E293B"/>
+                <w:sz w:val="18"/>
+              </w:rPr>
+              <w:t>8.4+</w:t>
+            </w:r>
+          </w:p>
+        </w:tc>
+      </w:tr>
+      <w:tr>
+        <w:tc>
+          <w:tcPr>
+            <w:tcW w:type="dxa" w:w="2880"/>
+            <w:shd w:fill="F1F5F9" w:val="clear"/>
+          </w:tcPr>
+          <w:p>
+            <w:r>
+              <w:rPr>
+                <w:color w:val="1E293B"/>
+                <w:sz w:val="18"/>
+              </w:rPr>
+              <w:t>Framework Backend</w:t>
+            </w:r>
+          </w:p>
+        </w:tc>
+        <w:tc>
+          <w:tcPr>
+            <w:tcW w:type="dxa" w:w="2880"/>
+            <w:shd w:fill="F1F5F9" w:val="clear"/>
+          </w:tcPr>
+          <w:p>
+            <w:r>
+              <w:rPr>
+                <w:color w:val="1E293B"/>
+                <w:sz w:val="18"/>
+              </w:rPr>
+              <w:t>Laravel</w:t>
+            </w:r>
+          </w:p>
+        </w:tc>
+        <w:tc>
+          <w:tcPr>
+            <w:tcW w:type="dxa" w:w="2880"/>
+            <w:shd w:fill="F1F5F9" w:val="clear"/>
+          </w:tcPr>
+          <w:p>
+            <w:r>
+              <w:rPr>
+                <w:color w:val="1E293B"/>
+                <w:sz w:val="18"/>
+              </w:rPr>
+              <w:t>13.7</w:t>
+            </w:r>
+          </w:p>
+        </w:tc>
+      </w:tr>
+      <w:tr>
+        <w:tc>
+          <w:tcPr>
+            <w:tcW w:type="dxa" w:w="2880"/>
+          </w:tcPr>
+          <w:p>
+            <w:r>
+              <w:rPr>
+                <w:color w:val="1E293B"/>
+                <w:sz w:val="18"/>
+              </w:rPr>
+              <w:t>Base de Donnees</w:t>
+            </w:r>
+          </w:p>
+        </w:tc>
+        <w:tc>
+          <w:tcPr>
+            <w:tcW w:type="dxa" w:w="2880"/>
+          </w:tcPr>
+          <w:p>
+            <w:r>
+              <w:rPr>
+                <w:color w:val="1E293B"/>
+                <w:sz w:val="18"/>
+              </w:rPr>
+              <w:t>MySQL</w:t>
+            </w:r>
+          </w:p>
+        </w:tc>
+        <w:tc>
+          <w:tcPr>
+            <w:tcW w:type="dxa" w:w="2880"/>
+          </w:tcPr>
+          <w:p>
+            <w:r>
+              <w:rPr>
+                <w:color w:val="1E293B"/>
+                <w:sz w:val="18"/>
+              </w:rPr>
+              <w:t>8.0+</w:t>
+            </w:r>
+          </w:p>
+        </w:tc>
+      </w:tr>
+      <w:tr>
+        <w:tc>
+          <w:tcPr>
+            <w:tcW w:type="dxa" w:w="2880"/>
+            <w:shd w:fill="F1F5F9" w:val="clear"/>
+          </w:tcPr>
+          <w:p>
+            <w:r>
+              <w:rPr>
+                <w:color w:val="1E293B"/>
+                <w:sz w:val="18"/>
+              </w:rPr>
+              <w:t>Frontend - Templates</w:t>
+            </w:r>
+          </w:p>
+        </w:tc>
+        <w:tc>
+          <w:tcPr>
+            <w:tcW w:type="dxa" w:w="2880"/>
+            <w:shd w:fill="F1F5F9" w:val="clear"/>
+          </w:tcPr>
+          <w:p>
+            <w:r>
+              <w:rPr>
+                <w:color w:val="1E293B"/>
+                <w:sz w:val="18"/>
+              </w:rPr>
+              <w:t>Blade (Laravel)</w:t>
+            </w:r>
+          </w:p>
+        </w:tc>
+        <w:tc>
+          <w:tcPr>
+            <w:tcW w:type="dxa" w:w="2880"/>
+            <w:shd w:fill="F1F5F9" w:val="clear"/>
+          </w:tcPr>
+          <w:p>
+            <w:r>
+              <w:rPr>
+                <w:color w:val="1E293B"/>
+                <w:sz w:val="18"/>
+              </w:rPr>
+              <w:t>-</w:t>
+            </w:r>
+          </w:p>
+        </w:tc>
+      </w:tr>
+      <w:tr>
+        <w:tc>
+          <w:tcPr>
+            <w:tcW w:type="dxa" w:w="2880"/>
+          </w:tcPr>
+          <w:p>
+            <w:r>
+              <w:rPr>
+                <w:color w:val="1E293B"/>
+                <w:sz w:val="18"/>
+              </w:rPr>
+              <w:t>Frontend - Reactivite</w:t>
+            </w:r>
+          </w:p>
+        </w:tc>
+        <w:tc>
+          <w:tcPr>
+            <w:tcW w:type="dxa" w:w="2880"/>
+          </w:tcPr>
+          <w:p>
+            <w:r>
+              <w:rPr>
+                <w:color w:val="1E293B"/>
+                <w:sz w:val="18"/>
+              </w:rPr>
+              <w:t>Alpine.js</w:t>
+            </w:r>
+          </w:p>
+        </w:tc>
+        <w:tc>
+          <w:tcPr>
+            <w:tcW w:type="dxa" w:w="2880"/>
+          </w:tcPr>
+          <w:p>
+            <w:r>
+              <w:rPr>
+                <w:color w:val="1E293B"/>
+                <w:sz w:val="18"/>
+              </w:rPr>
+              <w:t>3.x</w:t>
+            </w:r>
+          </w:p>
+        </w:tc>
+      </w:tr>
+      <w:tr>
+        <w:tc>
+          <w:tcPr>
+            <w:tcW w:type="dxa" w:w="2880"/>
+            <w:shd w:fill="F1F5F9" w:val="clear"/>
+          </w:tcPr>
+          <w:p>
+            <w:r>
+              <w:rPr>
+                <w:color w:val="1E293B"/>
+                <w:sz w:val="18"/>
+              </w:rPr>
+              <w:t>Frontend - Style</w:t>
+            </w:r>
+          </w:p>
+        </w:tc>
+        <w:tc>
+          <w:tcPr>
+            <w:tcW w:type="dxa" w:w="2880"/>
+            <w:shd w:fill="F1F5F9" w:val="clear"/>
+          </w:tcPr>
+          <w:p>
+            <w:r>
+              <w:rPr>
+                <w:color w:val="1E293B"/>
+                <w:sz w:val="18"/>
+              </w:rPr>
+              <w:t>Tailwind CSS</w:t>
+            </w:r>
+          </w:p>
+        </w:tc>
+        <w:tc>
+          <w:tcPr>
+            <w:tcW w:type="dxa" w:w="2880"/>
+            <w:shd w:fill="F1F5F9" w:val="clear"/>
+          </w:tcPr>
+          <w:p>
+            <w:r>
+              <w:rPr>
+                <w:color w:val="1E293B"/>
+                <w:sz w:val="18"/>
+              </w:rPr>
+              <w:t>3.x</w:t>
+            </w:r>
+          </w:p>
+        </w:tc>
+      </w:tr>
+      <w:tr>
+        <w:tc>
+          <w:tcPr>
+            <w:tcW w:type="dxa" w:w="2880"/>
+          </w:tcPr>
+          <w:p>
+            <w:r>
+              <w:rPr>
+                <w:color w:val="1E293B"/>
+                <w:sz w:val="18"/>
+              </w:rPr>
+              <w:t>Build Frontend</w:t>
+            </w:r>
+          </w:p>
+        </w:tc>
+        <w:tc>
+          <w:tcPr>
+            <w:tcW w:type="dxa" w:w="2880"/>
+          </w:tcPr>
+          <w:p>
+            <w:r>
+              <w:rPr>
+                <w:color w:val="1E293B"/>
+                <w:sz w:val="18"/>
+              </w:rPr>
+              <w:t>Vite</w:t>
+            </w:r>
+          </w:p>
+        </w:tc>
+        <w:tc>
+          <w:tcPr>
+            <w:tcW w:type="dxa" w:w="2880"/>
+          </w:tcPr>
+          <w:p>
+            <w:r>
+              <w:rPr>
+                <w:color w:val="1E293B"/>
+                <w:sz w:val="18"/>
+              </w:rPr>
+              <w:t>8.x</w:t>
+            </w:r>
+          </w:p>
+        </w:tc>
+      </w:tr>
+      <w:tr>
+        <w:tc>
+          <w:tcPr>
+            <w:tcW w:type="dxa" w:w="2880"/>
+            <w:shd w:fill="F1F5F9" w:val="clear"/>
+          </w:tcPr>
+          <w:p>
+            <w:r>
+              <w:rPr>
+                <w:color w:val="1E293B"/>
+                <w:sz w:val="18"/>
+              </w:rPr>
+              <w:t>Authentification</w:t>
+            </w:r>
+          </w:p>
+        </w:tc>
+        <w:tc>
+          <w:tcPr>
+            <w:tcW w:type="dxa" w:w="2880"/>
+            <w:shd w:fill="F1F5F9" w:val="clear"/>
+          </w:tcPr>
+          <w:p>
+            <w:r>
+              <w:rPr>
+                <w:color w:val="1E293B"/>
+                <w:sz w:val="18"/>
+              </w:rPr>
+              <w:t>Laravel Breeze</w:t>
+            </w:r>
+          </w:p>
+        </w:tc>
+        <w:tc>
+          <w:tcPr>
+            <w:tcW w:type="dxa" w:w="2880"/>
+            <w:shd w:fill="F1F5F9" w:val="clear"/>
+          </w:tcPr>
+          <w:p>
+            <w:r>
+              <w:rPr>
+                <w:color w:val="1E293B"/>
+                <w:sz w:val="18"/>
+              </w:rPr>
+              <w:t>-</w:t>
+            </w:r>
+          </w:p>
+        </w:tc>
+      </w:tr>
+      <w:tr>
+        <w:tc>
+          <w:tcPr>
+            <w:tcW w:type="dxa" w:w="2880"/>
+          </w:tcPr>
+          <w:p>
+            <w:r>
+              <w:rPr>
+                <w:color w:val="1E293B"/>
+                <w:sz w:val="18"/>
+              </w:rPr>
+              <w:t>Serveur Web (dev)</w:t>
+            </w:r>
+          </w:p>
+        </w:tc>
+        <w:tc>
+          <w:tcPr>
+            <w:tcW w:type="dxa" w:w="2880"/>
+          </w:tcPr>
+          <w:p>
+            <w:r>
+              <w:rPr>
+                <w:color w:val="1E293B"/>
+                <w:sz w:val="18"/>
+              </w:rPr>
+              <w:t>artisan serve</w:t>
+            </w:r>
+          </w:p>
+        </w:tc>
+        <w:tc>
+          <w:tcPr>
+            <w:tcW w:type="dxa" w:w="2880"/>
+          </w:tcPr>
+          <w:p>
+            <w:r>
+              <w:rPr>
+                <w:color w:val="1E293B"/>
+                <w:sz w:val="18"/>
+              </w:rPr>
+              <w:t>-</w:t>
+            </w:r>
+          </w:p>
+        </w:tc>
+      </w:tr>
+      <w:tr>
+        <w:tc>
+          <w:tcPr>
+            <w:tcW w:type="dxa" w:w="2880"/>
+            <w:shd w:fill="F1F5F9" w:val="clear"/>
+          </w:tcPr>
+          <w:p>
+            <w:r>
+              <w:rPr>
+                <w:color w:val="1E293B"/>
+                <w:sz w:val="18"/>
+              </w:rPr>
+              <w:t>Gestionnaire de paquets PHP</w:t>
+            </w:r>
+          </w:p>
+        </w:tc>
+        <w:tc>
+          <w:tcPr>
+            <w:tcW w:type="dxa" w:w="2880"/>
+            <w:shd w:fill="F1F5F9" w:val="clear"/>
+          </w:tcPr>
+          <w:p>
+            <w:r>
+              <w:rPr>
+                <w:color w:val="1E293B"/>
+                <w:sz w:val="18"/>
+              </w:rPr>
+              <w:t>Composer</w:t>
+            </w:r>
+          </w:p>
+        </w:tc>
+        <w:tc>
+          <w:tcPr>
+            <w:tcW w:type="dxa" w:w="2880"/>
+            <w:shd w:fill="F1F5F9" w:val="clear"/>
+          </w:tcPr>
+          <w:p>
+            <w:r>
+              <w:rPr>
+                <w:color w:val="1E293B"/>
+                <w:sz w:val="18"/>
+              </w:rPr>
+              <w:t>2.x</w:t>
+            </w:r>
+          </w:p>
+        </w:tc>
+      </w:tr>
+      <w:tr>
+        <w:tc>
+          <w:tcPr>
+            <w:tcW w:type="dxa" w:w="2880"/>
+          </w:tcPr>
+          <w:p>
+            <w:r>
+              <w:rPr>
+                <w:color w:val="1E293B"/>
+                <w:sz w:val="18"/>
+              </w:rPr>
+              <w:t>Gestionnaire de paquets JS</w:t>
+            </w:r>
+          </w:p>
+        </w:tc>
+        <w:tc>
+          <w:tcPr>
+            <w:tcW w:type="dxa" w:w="2880"/>
+          </w:tcPr>
+          <w:p>
+            <w:r>
+              <w:rPr>
+                <w:color w:val="1E293B"/>
+                <w:sz w:val="18"/>
+              </w:rPr>
+              <w:t>NPM</w:t>
+            </w:r>
+          </w:p>
+        </w:tc>
+        <w:tc>
+          <w:tcPr>
+            <w:tcW w:type="dxa" w:w="2880"/>
+          </w:tcPr>
+          <w:p>
+            <w:r>
+              <w:rPr>
+                <w:color w:val="1E293B"/>
+                <w:sz w:val="18"/>
+              </w:rPr>
+              <w:t>18+</w:t>
+            </w:r>
+          </w:p>
+        </w:tc>
+      </w:tr>
+    </w:tbl>
+    <w:p/>
     <w:sectPr>
       <w:pgSz w:w="12240" w:h="15840"/>
       <w:pgMar w:top="1440" w:right="1800" w:bottom="1440" w:left="1800" w:header="720" w:footer="720" w:gutter="0"/>
@@ -560,8 +3046,12 @@
     <w:name w:val="Normal"/>
     <w:qFormat/>
     <w:rsid w:val="00FC693F"/>
+    <w:pPr>
+      <w:spacing w:after="120" w:line="276" w:lineRule="auto"/>
+    </w:pPr>
     <w:rPr>
       <w:rFonts w:ascii="Calibri" w:hAnsi="Calibri"/>
+      <w:color w:val="1E293B"/>
       <w:sz w:val="22"/>
     </w:rPr>
   </w:style>
@@ -628,7 +3118,7 @@
       <w:b/>
       <w:bCs/>
       <w:color w:val="1A4BAD"/>
-      <w:sz w:val="28"/>
+      <w:sz w:val="44"/>
       <w:szCs w:val="28"/>
     </w:rPr>
   </w:style>
@@ -652,7 +3142,7 @@
       <w:b/>
       <w:bCs/>
       <w:color w:val="285ABE"/>
-      <w:sz w:val="26"/>
+      <w:sz w:val="32"/>
       <w:szCs w:val="26"/>
     </w:rPr>
   </w:style>
@@ -675,7 +3165,8 @@
       <w:rFonts w:asciiTheme="majorHAnsi" w:eastAsiaTheme="majorEastAsia" w:hAnsiTheme="majorHAnsi" w:cstheme="majorBidi" w:ascii="Calibri" w:hAnsi="Calibri"/>
       <w:b/>
       <w:bCs/>
-      <w:color w:val="505050"/>
+      <w:color w:val="1E293B"/>
+      <w:sz w:val="26"/>
     </w:rPr>
   </w:style>
   <w:style w:type="paragraph" w:styleId="Heading4">

</xml_diff>